<commit_message>
Prepare 1.1.0 release: test report, regenerated examples, installer fixes
- Windows silent update: let the installer's [Run] entry restart the app and
  turn off Restart Manager restarts so it cannot start twice; numeric version
  resource for pre-release tags.
- Examples regenerated with both PDF engines (training sections included).
- TEST_REPORT for 1.1.0, REQUIREMENTS.md, DATA_MODEL.md, implementation status.

Co-Authored-By: Claude Opus 5.5 <noreply@anthropic.com>
Claude-Session: https://claude.ai/code/session_0135o1EM28oRdMNvZqLYvJew
</commit_message>
<xml_diff>
--- a/examples/example_academic_extended.docx
+++ b/examples/example_academic_extended.docx
@@ -1749,7 +1749,7 @@
         </w:pBdr>
       </w:pPr>
       <w:r>
-        <w:t>Certifications &amp; Training</w:t>
+        <w:t>Certifications &amp; Licences</w:t>
       </w:r>
     </w:p>
     <w:p>
@@ -1770,7 +1770,7 @@
         <w:rPr>
           <w:b/>
         </w:rPr>
-        <w:t>Deep Learning for Edge Devices (40-hour course)</w:t>
+        <w:t>Deep Learning for Edge Devices</w:t>
       </w:r>
     </w:p>
     <w:p>
@@ -1783,6 +1783,90 @@
           <w:i/>
         </w:rPr>
         <w:t>Example Academy of Applied Computing</w:t>
+      </w:r>
+    </w:p>
+    <w:p>
+      <w:pPr>
+        <w:pStyle w:val="RISBody"/>
+        <w:ind w:left="1361"/>
+      </w:pPr>
+      <w:r>
+        <w:t>Used the model-compression techniques to deploy the drone super-resolution model on Jetson modules.</w:t>
+      </w:r>
+    </w:p>
+    <w:p>
+      <w:pPr>
+        <w:pStyle w:val="RISMeta"/>
+        <w:ind w:left="1361"/>
+      </w:pPr>
+      <w:r>
+        <w:rPr>
+          <w:b/>
+        </w:rPr>
+        <w:t xml:space="preserve">Duration: </w:t>
+      </w:r>
+      <w:r>
+        <w:t>40 hours</w:t>
+      </w:r>
+    </w:p>
+    <w:p>
+      <w:pPr>
+        <w:pStyle w:val="RISMeta"/>
+        <w:ind w:left="1361"/>
+      </w:pPr>
+      <w:r>
+        <w:rPr>
+          <w:b/>
+        </w:rPr>
+        <w:t xml:space="preserve">Credential: </w:t>
+      </w:r>
+      <w:r>
+        <w:t>EAAC-DL-0042</w:t>
+      </w:r>
+    </w:p>
+    <w:p>
+      <w:pPr>
+        <w:pStyle w:val="RISMeta"/>
+        <w:ind w:left="1361"/>
+      </w:pPr>
+      <w:r>
+        <w:rPr>
+          <w:b/>
+        </w:rPr>
+        <w:t xml:space="preserve">Valid until: </w:t>
+      </w:r>
+      <w:r>
+        <w:t>2029</w:t>
+      </w:r>
+    </w:p>
+    <w:p>
+      <w:pPr>
+        <w:pStyle w:val="RISMeta"/>
+        <w:ind w:left="1361"/>
+      </w:pPr>
+      <w:r>
+        <w:rPr>
+          <w:b/>
+        </w:rPr>
+        <w:t xml:space="preserve">Mode: </w:t>
+      </w:r>
+      <w:r>
+        <w:t>Online</w:t>
+      </w:r>
+    </w:p>
+    <w:p>
+      <w:pPr>
+        <w:pStyle w:val="RISMeta"/>
+        <w:ind w:left="1361"/>
+      </w:pPr>
+      <w:r>
+        <w:rPr>
+          <w:b/>
+        </w:rPr>
+        <w:t xml:space="preserve">Skills: </w:t>
+      </w:r>
+      <w:r>
+        <w:t>Deep learning, Edge AI, TensorRT</w:t>
       </w:r>
     </w:p>
     <w:p>
@@ -1804,7 +1888,7 @@
         <w:ind w:left="1361" w:hanging="1361"/>
       </w:pPr>
       <w:r>
-        <w:t>2019</w:t>
+        <w:t>2016</w:t>
       </w:r>
       <w:r>
         <w:tab/>
@@ -1813,7 +1897,14 @@
         <w:rPr>
           <w:b/>
         </w:rPr>
-        <w:t>Public Procurement and GFR 2017 (5-day programme)</w:t>
+        <w:t>Academic English proficiency test</w:t>
+      </w:r>
+      <w:r>
+        <w:rPr>
+          <w:i/>
+          <w:color w:val="4A4A4A"/>
+        </w:rPr>
+        <w:t xml:space="preserve"> (Expired)</w:t>
       </w:r>
     </w:p>
     <w:p>
@@ -1825,7 +1916,420 @@
         <w:rPr>
           <w:i/>
         </w:rPr>
-        <w:t>Example Institute of Public Administration</w:t>
+        <w:t>Example Language Testing Board</w:t>
+      </w:r>
+    </w:p>
+    <w:p>
+      <w:pPr>
+        <w:pStyle w:val="RISMeta"/>
+        <w:ind w:left="1361"/>
+      </w:pPr>
+      <w:r>
+        <w:rPr>
+          <w:b/>
+        </w:rPr>
+        <w:t xml:space="preserve">Result: </w:t>
+      </w:r>
+      <w:r>
+        <w:t>Overall band 8.0</w:t>
+      </w:r>
+    </w:p>
+    <w:p>
+      <w:pPr>
+        <w:pStyle w:val="RISMeta"/>
+        <w:ind w:left="1361"/>
+      </w:pPr>
+      <w:r>
+        <w:rPr>
+          <w:b/>
+        </w:rPr>
+        <w:t xml:space="preserve">Expired: </w:t>
+      </w:r>
+      <w:r>
+        <w:t>2018</w:t>
+      </w:r>
+    </w:p>
+    <w:p>
+      <w:pPr>
+        <w:spacing w:before="0" w:after="0" w:lineRule="exact" w:line="100"/>
+      </w:pPr>
+      <w:r>
+        <w:rPr>
+          <w:sz w:val="2"/>
+        </w:rPr>
+      </w:r>
+    </w:p>
+    <w:p>
+      <w:pPr>
+        <w:pStyle w:val="Heading1"/>
+        <w:pBdr>
+          <w:bottom w:val="single" w:sz="5" w:space="2" w:color="1D3557"/>
+        </w:pBdr>
+      </w:pPr>
+      <w:r>
+        <w:t>Professional Courses</w:t>
+      </w:r>
+    </w:p>
+    <w:p>
+      <w:pPr>
+        <w:pStyle w:val="Heading2"/>
+        <w:tabs>
+          <w:tab w:pos="1361" w:val="left"/>
+        </w:tabs>
+        <w:ind w:left="1361" w:hanging="1361"/>
+      </w:pPr>
+      <w:r>
+        <w:t>2018</w:t>
+      </w:r>
+      <w:r>
+        <w:tab/>
+      </w:r>
+      <w:r>
+        <w:rPr>
+          <w:b/>
+        </w:rPr>
+        <w:t>Introduction to Machine Learning (12-week course)</w:t>
+      </w:r>
+    </w:p>
+    <w:p>
+      <w:pPr>
+        <w:pStyle w:val="RISEntrySub"/>
+        <w:ind w:left="1361"/>
+      </w:pPr>
+      <w:r>
+        <w:rPr>
+          <w:i/>
+        </w:rPr>
+        <w:t>Example Online University Consortium</w:t>
+      </w:r>
+    </w:p>
+    <w:p>
+      <w:pPr>
+        <w:pStyle w:val="RISMeta"/>
+        <w:ind w:left="1361"/>
+      </w:pPr>
+      <w:r>
+        <w:rPr>
+          <w:b/>
+        </w:rPr>
+        <w:t xml:space="preserve">Duration: </w:t>
+      </w:r>
+      <w:r>
+        <w:t>48 hours</w:t>
+      </w:r>
+    </w:p>
+    <w:p>
+      <w:pPr>
+        <w:pStyle w:val="RISMeta"/>
+        <w:ind w:left="1361"/>
+      </w:pPr>
+      <w:r>
+        <w:rPr>
+          <w:b/>
+        </w:rPr>
+        <w:t xml:space="preserve">Result: </w:t>
+      </w:r>
+      <w:r>
+        <w:t>Elite (82%)</w:t>
+      </w:r>
+    </w:p>
+    <w:p>
+      <w:pPr>
+        <w:pStyle w:val="RISMeta"/>
+        <w:ind w:left="1361"/>
+      </w:pPr>
+      <w:r>
+        <w:rPr>
+          <w:b/>
+        </w:rPr>
+        <w:t xml:space="preserve">Mode: </w:t>
+      </w:r>
+      <w:r>
+        <w:t>Online</w:t>
+      </w:r>
+    </w:p>
+    <w:p>
+      <w:pPr>
+        <w:pStyle w:val="RISMeta"/>
+        <w:ind w:left="1361"/>
+      </w:pPr>
+      <w:r>
+        <w:rPr>
+          <w:b/>
+        </w:rPr>
+        <w:t xml:space="preserve">Skills: </w:t>
+      </w:r>
+      <w:r>
+        <w:t>Machine learning, Python</w:t>
+      </w:r>
+    </w:p>
+    <w:p>
+      <w:pPr>
+        <w:spacing w:before="0" w:after="0" w:lineRule="exact" w:line="100"/>
+      </w:pPr>
+      <w:r>
+        <w:rPr>
+          <w:sz w:val="2"/>
+        </w:rPr>
+      </w:r>
+    </w:p>
+    <w:p>
+      <w:pPr>
+        <w:pStyle w:val="Heading1"/>
+        <w:pBdr>
+          <w:bottom w:val="single" w:sz="5" w:space="2" w:color="1D3557"/>
+        </w:pBdr>
+      </w:pPr>
+      <w:r>
+        <w:t>Workshops, Seminars &amp; Conferences Attended</w:t>
+      </w:r>
+    </w:p>
+    <w:p>
+      <w:pPr>
+        <w:pStyle w:val="Heading2"/>
+        <w:tabs>
+          <w:tab w:pos="1361" w:val="left"/>
+        </w:tabs>
+        <w:ind w:left="1361" w:hanging="1361"/>
+      </w:pPr>
+      <w:r>
+        <w:t>2023</w:t>
+      </w:r>
+      <w:r>
+        <w:tab/>
+      </w:r>
+      <w:r>
+        <w:rPr>
+          <w:b/>
+        </w:rPr>
+        <w:t>Workshop on Efficient Deep Learning for Embedded Vision</w:t>
+      </w:r>
+    </w:p>
+    <w:p>
+      <w:pPr>
+        <w:pStyle w:val="RISEntrySub"/>
+        <w:ind w:left="1361"/>
+      </w:pPr>
+      <w:r>
+        <w:rPr>
+          <w:i/>
+        </w:rPr>
+        <w:t>Example Conference on Instrumentation (ECI 2023)</w:t>
+      </w:r>
+    </w:p>
+    <w:p>
+      <w:pPr>
+        <w:pStyle w:val="RISMeta"/>
+        <w:ind w:left="1361"/>
+      </w:pPr>
+      <w:r>
+        <w:rPr>
+          <w:b/>
+        </w:rPr>
+        <w:t xml:space="preserve">Duration: </w:t>
+      </w:r>
+      <w:r>
+        <w:t>2 days</w:t>
+      </w:r>
+    </w:p>
+    <w:p>
+      <w:pPr>
+        <w:spacing w:before="0" w:after="0" w:lineRule="exact" w:line="100"/>
+      </w:pPr>
+      <w:r>
+        <w:rPr>
+          <w:sz w:val="2"/>
+        </w:rPr>
+      </w:r>
+    </w:p>
+    <w:p>
+      <w:pPr>
+        <w:pStyle w:val="Heading2"/>
+        <w:tabs>
+          <w:tab w:pos="1361" w:val="left"/>
+        </w:tabs>
+        <w:ind w:left="1361" w:hanging="1361"/>
+      </w:pPr>
+      <w:r>
+        <w:t>2021</w:t>
+      </w:r>
+      <w:r>
+        <w:tab/>
+      </w:r>
+      <w:r>
+        <w:rPr>
+          <w:b/>
+        </w:rPr>
+        <w:t>National Seminar on Upper-Air Observing Systems</w:t>
+      </w:r>
+    </w:p>
+    <w:p>
+      <w:pPr>
+        <w:pStyle w:val="RISEntrySub"/>
+        <w:ind w:left="1361"/>
+      </w:pPr>
+      <w:r>
+        <w:rPr>
+          <w:i/>
+        </w:rPr>
+        <w:t>Example Society of Atmospheric Instrumentation</w:t>
+      </w:r>
+    </w:p>
+    <w:p>
+      <w:pPr>
+        <w:pStyle w:val="RISMeta"/>
+        <w:ind w:left="1361"/>
+      </w:pPr>
+      <w:r>
+        <w:rPr>
+          <w:b/>
+        </w:rPr>
+        <w:t xml:space="preserve">Duration: </w:t>
+      </w:r>
+      <w:r>
+        <w:t>1 day</w:t>
+      </w:r>
+    </w:p>
+    <w:p>
+      <w:pPr>
+        <w:spacing w:before="0" w:after="0" w:lineRule="exact" w:line="100"/>
+      </w:pPr>
+      <w:r>
+        <w:rPr>
+          <w:sz w:val="2"/>
+        </w:rPr>
+      </w:r>
+    </w:p>
+    <w:p>
+      <w:pPr>
+        <w:pStyle w:val="Heading1"/>
+        <w:pBdr>
+          <w:bottom w:val="single" w:sz="5" w:space="2" w:color="1D3557"/>
+        </w:pBdr>
+      </w:pPr>
+      <w:r>
+        <w:t>Training Programmes</w:t>
+      </w:r>
+    </w:p>
+    <w:p>
+      <w:pPr>
+        <w:pStyle w:val="Heading2"/>
+        <w:tabs>
+          <w:tab w:pos="1361" w:val="left"/>
+        </w:tabs>
+        <w:ind w:left="1361" w:hanging="1361"/>
+      </w:pPr>
+      <w:r>
+        <w:t>2019</w:t>
+      </w:r>
+      <w:r>
+        <w:tab/>
+      </w:r>
+      <w:r>
+        <w:rPr>
+          <w:b/>
+        </w:rPr>
+        <w:t>Public Procurement and GFR 2017</w:t>
+      </w:r>
+    </w:p>
+    <w:p>
+      <w:pPr>
+        <w:pStyle w:val="RISEntrySub"/>
+        <w:ind w:left="1361"/>
+      </w:pPr>
+      <w:r>
+        <w:rPr>
+          <w:i/>
+        </w:rPr>
+        <w:t>Example Institute of Public Administration (sponsored by Kestrel Atmospheric Instrumentation Laboratory)</w:t>
+      </w:r>
+    </w:p>
+    <w:p>
+      <w:pPr>
+        <w:pStyle w:val="RISMeta"/>
+        <w:ind w:left="1361"/>
+      </w:pPr>
+      <w:r>
+        <w:rPr>
+          <w:b/>
+        </w:rPr>
+        <w:t xml:space="preserve">Duration: </w:t>
+      </w:r>
+      <w:r>
+        <w:t>5 days</w:t>
+      </w:r>
+    </w:p>
+    <w:p>
+      <w:pPr>
+        <w:pStyle w:val="RISMeta"/>
+        <w:ind w:left="1361"/>
+      </w:pPr>
+      <w:r>
+        <w:rPr>
+          <w:b/>
+        </w:rPr>
+        <w:t xml:space="preserve">Skills: </w:t>
+      </w:r>
+      <w:r>
+        <w:t>Public procurement, GFR 2017, GeM</w:t>
+      </w:r>
+    </w:p>
+    <w:p>
+      <w:pPr>
+        <w:spacing w:before="0" w:after="0" w:lineRule="exact" w:line="100"/>
+      </w:pPr>
+      <w:r>
+        <w:rPr>
+          <w:sz w:val="2"/>
+        </w:rPr>
+      </w:r>
+    </w:p>
+    <w:p>
+      <w:pPr>
+        <w:pStyle w:val="Heading2"/>
+        <w:tabs>
+          <w:tab w:pos="1361" w:val="left"/>
+        </w:tabs>
+        <w:ind w:left="1361" w:hanging="1361"/>
+      </w:pPr>
+      <w:r>
+        <w:t>2020</w:t>
+      </w:r>
+      <w:r>
+        <w:tab/>
+      </w:r>
+      <w:r>
+        <w:rPr>
+          <w:b/>
+        </w:rPr>
+        <w:t>Mid-Career Training Programme for Scientists</w:t>
+      </w:r>
+    </w:p>
+    <w:p>
+      <w:pPr>
+        <w:pStyle w:val="RISEntrySub"/>
+        <w:ind w:left="1361"/>
+      </w:pPr>
+      <w:r>
+        <w:rPr>
+          <w:i/>
+        </w:rPr>
+        <w:t>Example Institute of Scientific Administration (sponsored by Ministry of Example Sciences)</w:t>
+      </w:r>
+    </w:p>
+    <w:p>
+      <w:pPr>
+        <w:pStyle w:val="RISMeta"/>
+        <w:ind w:left="1361"/>
+      </w:pPr>
+      <w:r>
+        <w:rPr>
+          <w:b/>
+        </w:rPr>
+        <w:t xml:space="preserve">Duration: </w:t>
+      </w:r>
+      <w:r>
+        <w:t>10 days</w:t>
       </w:r>
     </w:p>
     <w:p>

</xml_diff>

<commit_message>
Version 1.2.0: Scientist F/G formats, chart choices, openings import
- Deputation application in the DoPT bio-data proforma (items 1-18, declaration,
  employer's certificate); private items print only when opted in, and the
  candidate's own statements are never generated.
- ATS-safe Senior Scientist (F/G) CV with justification against the vacancy, and
  a senior graphical profile; three new templates.
- Chart choices per resume (off, timeline, bars, donut, pie, columns, line,
  cumulative, dots, words, tiles), with template defaults in the designer.
- Import of the weekly openings list as vacancies; recommended format and
  checklist per vacancy; recruiter formats; two senior career presets.
- PDF engine keeps table rows whole and avoids gaps before long tables.

Co-Authored-By: Claude Opus 5.5 <noreply@anthropic.com>
Claude-Session: https://claude.ai/code/session_0135o1EM28oRdMNvZqLYvJew
</commit_message>
<xml_diff>
--- a/examples/example_academic_extended.docx
+++ b/examples/example_academic_extended.docx
@@ -488,7 +488,7 @@
         <w:ind w:left="1871" w:hanging="255"/>
       </w:pPr>
       <w:r>
-        <w:t>Supervise technicians and plan preventive maintenance for workshop test equipment.</w:t>
+        <w:t>Introduced a job-card and spares-inventory system for instrument repairs and calibration work.</w:t>
       </w:r>
     </w:p>
     <w:p>
@@ -501,7 +501,7 @@
         <w:ind w:left="1871" w:hanging="255"/>
       </w:pPr>
       <w:r>
-        <w:t>Introduced a job-card and spares-inventory system for instrument repairs and calibration work.</w:t>
+        <w:t>Supervise technicians and plan preventive maintenance for workshop test equipment.</w:t>
       </w:r>
     </w:p>
     <w:p>
@@ -620,7 +620,7 @@
         <w:ind w:left="1616" w:hanging="255"/>
       </w:pPr>
       <w:r>
-        <w:t>Planned environmental qualification (MIL-STD-810 vibration, temperature and humidity) for line-replaceable units and documented the test results.</w:t>
+        <w:t>Mentored graduate engineer trainees on avionics bus protocols and test documentation.</w:t>
       </w:r>
     </w:p>
     <w:p>
@@ -633,7 +633,7 @@
         <w:ind w:left="1616" w:hanging="255"/>
       </w:pPr>
       <w:r>
-        <w:t>Mentored graduate engineer trainees on avionics bus protocols and test documentation.</w:t>
+        <w:t>Planned environmental qualification (MIL-STD-810 vibration, temperature and humidity) for line-replaceable units and documented the test results.</w:t>
       </w:r>
     </w:p>
     <w:p>
@@ -699,275 +699,6 @@
       </w:pPr>
       <w:r>
         <w:t>Developed LabVIEW test sequences for power-supply and interface boards of avionics units.</w:t>
-      </w:r>
-    </w:p>
-    <w:p>
-      <w:pPr>
-        <w:spacing w:before="0" w:after="0" w:lineRule="exact" w:line="100"/>
-      </w:pPr>
-      <w:r>
-        <w:rPr>
-          <w:sz w:val="2"/>
-        </w:rPr>
-      </w:r>
-    </w:p>
-    <w:p>
-      <w:pPr>
-        <w:pStyle w:val="Heading1"/>
-        <w:pBdr>
-          <w:bottom w:val="single" w:sz="5" w:space="2" w:color="1D3557"/>
-        </w:pBdr>
-      </w:pPr>
-      <w:r>
-        <w:t>Key Projects</w:t>
-      </w:r>
-    </w:p>
-    <w:p>
-      <w:pPr>
-        <w:pStyle w:val="Heading2"/>
-        <w:tabs>
-          <w:tab w:pos="1361" w:val="left"/>
-        </w:tabs>
-        <w:ind w:left="1361" w:hanging="1361"/>
-      </w:pPr>
-      <w:r>
-        <w:t>2021 – Present</w:t>
-      </w:r>
-      <w:r>
-        <w:tab/>
-      </w:r>
-      <w:r>
-        <w:rPr>
-          <w:b/>
-        </w:rPr>
-        <w:t>Edge super-resolution pipeline for UAV imagery</w:t>
-      </w:r>
-      <w:r>
-        <w:rPr>
-          <w:i/>
-          <w:color w:val="4A4A4A"/>
-        </w:rPr>
-        <w:t xml:space="preserve"> (Ongoing)</w:t>
-      </w:r>
-    </w:p>
-    <w:p>
-      <w:pPr>
-        <w:pStyle w:val="RISEntrySub"/>
-        <w:ind w:left="1361"/>
-      </w:pPr>
-      <w:r>
-        <w:rPr>
-          <w:i/>
-        </w:rPr>
-        <w:t>Principal investigator, Kestrel Atmospheric Instrumentation Laboratory</w:t>
-      </w:r>
-    </w:p>
-    <w:p>
-      <w:pPr>
-        <w:pStyle w:val="RISBody"/>
-        <w:ind w:left="1361"/>
-      </w:pPr>
-      <w:r>
-        <w:t>Research prototype that enhances low-resolution UAV video in real time on embedded GPUs using pruned and distilled deep networks.</w:t>
-      </w:r>
-    </w:p>
-    <w:p>
-      <w:pPr>
-        <w:pStyle w:val="RISMeta"/>
-        <w:ind w:left="1361"/>
-      </w:pPr>
-      <w:r>
-        <w:rPr>
-          <w:b/>
-        </w:rPr>
-        <w:t xml:space="preserve">Technologies: </w:t>
-      </w:r>
-      <w:r>
-        <w:t>NVIDIA Jetson Xavier NX, NVIDIA Jetson Orin Nano, PyTorch, TensorRT, ONNX, Docker, Structured pruning, Knowledge distillation, INT8 quantisation</w:t>
-      </w:r>
-    </w:p>
-    <w:p>
-      <w:pPr>
-        <w:pStyle w:val="RISBullet"/>
-        <w:numPr>
-          <w:ilvl w:val="0"/>
-          <w:numId w:val="90"/>
-        </w:numPr>
-        <w:ind w:left="1616" w:hanging="255"/>
-      </w:pPr>
-      <w:r>
-        <w:t>Implemented structured channel pruning and knowledge distillation to shrink the super-resolution network for embedded deployment.</w:t>
-      </w:r>
-    </w:p>
-    <w:p>
-      <w:pPr>
-        <w:pStyle w:val="RISBullet"/>
-        <w:numPr>
-          <w:ilvl w:val="0"/>
-          <w:numId w:val="90"/>
-        </w:numPr>
-        <w:ind w:left="1616" w:hanging="255"/>
-      </w:pPr>
-      <w:r>
-        <w:t>Converted models through ONNX to INT8 TensorRT engines, achieving 3.1× faster inference on Jetson Xavier NX.</w:t>
-      </w:r>
-    </w:p>
-    <w:p>
-      <w:pPr>
-        <w:spacing w:before="0" w:after="0" w:lineRule="exact" w:line="100"/>
-      </w:pPr>
-      <w:r>
-        <w:rPr>
-          <w:sz w:val="2"/>
-        </w:rPr>
-      </w:r>
-    </w:p>
-    <w:p>
-      <w:pPr>
-        <w:pStyle w:val="Heading2"/>
-        <w:tabs>
-          <w:tab w:pos="1361" w:val="left"/>
-        </w:tabs>
-        <w:ind w:left="1361" w:hanging="1361"/>
-      </w:pPr>
-      <w:r>
-        <w:t>2018 – 2019</w:t>
-      </w:r>
-      <w:r>
-        <w:tab/>
-      </w:r>
-      <w:r>
-        <w:rPr>
-          <w:b/>
-        </w:rPr>
-        <w:t>Radiosonde ground-station acceptance test protocol</w:t>
-      </w:r>
-    </w:p>
-    <w:p>
-      <w:pPr>
-        <w:pStyle w:val="RISEntrySub"/>
-        <w:ind w:left="1361"/>
-      </w:pPr>
-      <w:r>
-        <w:rPr>
-          <w:i/>
-        </w:rPr>
-        <w:t>Coordinator</w:t>
-      </w:r>
-    </w:p>
-    <w:p>
-      <w:pPr>
-        <w:pStyle w:val="RISBody"/>
-        <w:ind w:left="1361"/>
-      </w:pPr>
-      <w:r>
-        <w:t>Station acceptance testing varied between sites.</w:t>
-      </w:r>
-    </w:p>
-    <w:p>
-      <w:pPr>
-        <w:pStyle w:val="RISBullet"/>
-        <w:numPr>
-          <w:ilvl w:val="0"/>
-          <w:numId w:val="90"/>
-        </w:numPr>
-        <w:ind w:left="1616" w:hanging="255"/>
-      </w:pPr>
-      <w:r>
-        <w:t>A common acceptance protocol and checklist adopted for new ground-receiving systems.</w:t>
-      </w:r>
-    </w:p>
-    <w:p>
-      <w:pPr>
-        <w:spacing w:before="0" w:after="0" w:lineRule="exact" w:line="100"/>
-      </w:pPr>
-      <w:r>
-        <w:rPr>
-          <w:sz w:val="2"/>
-        </w:rPr>
-      </w:r>
-    </w:p>
-    <w:p>
-      <w:pPr>
-        <w:pStyle w:val="Heading2"/>
-        <w:tabs>
-          <w:tab w:pos="1361" w:val="left"/>
-        </w:tabs>
-        <w:ind w:left="1361" w:hanging="1361"/>
-      </w:pPr>
-      <w:r>
-        <w:t>2020 – 2022</w:t>
-      </w:r>
-      <w:r>
-        <w:tab/>
-      </w:r>
-      <w:r>
-        <w:rPr>
-          <w:b/>
-        </w:rPr>
-        <w:t>IoT monitoring of laboratory infrastructure</w:t>
-      </w:r>
-    </w:p>
-    <w:p>
-      <w:pPr>
-        <w:pStyle w:val="RISEntrySub"/>
-        <w:ind w:left="1361"/>
-      </w:pPr>
-      <w:r>
-        <w:rPr>
-          <w:i/>
-        </w:rPr>
-        <w:t>Project lead</w:t>
-      </w:r>
-    </w:p>
-    <w:p>
-      <w:pPr>
-        <w:pStyle w:val="RISBody"/>
-        <w:ind w:left="1361"/>
-      </w:pPr>
-      <w:r>
-        <w:t>Instrument rooms lacked continuous environmental and power-quality monitoring.</w:t>
-      </w:r>
-    </w:p>
-    <w:p>
-      <w:pPr>
-        <w:pStyle w:val="RISMeta"/>
-        <w:ind w:left="1361"/>
-      </w:pPr>
-      <w:r>
-        <w:rPr>
-          <w:b/>
-        </w:rPr>
-        <w:t xml:space="preserve">Technologies: </w:t>
-      </w:r>
-      <w:r>
-        <w:t>ESP32, Environmental sensors, MQTT, Node-RED, InfluxDB, Grafana</w:t>
-      </w:r>
-    </w:p>
-    <w:p>
-      <w:pPr>
-        <w:pStyle w:val="RISBullet"/>
-        <w:numPr>
-          <w:ilvl w:val="0"/>
-          <w:numId w:val="90"/>
-        </w:numPr>
-        <w:ind w:left="1616" w:hanging="255"/>
-      </w:pPr>
-      <w:r>
-        <w:t>Deployed ESP32 sensor nodes publishing over MQTT to a Node-RED flow, InfluxDB time-series storage and Grafana dashboards with threshold alerts.</w:t>
-      </w:r>
-    </w:p>
-    <w:p>
-      <w:pPr>
-        <w:pStyle w:val="RISBullet"/>
-        <w:numPr>
-          <w:ilvl w:val="0"/>
-          <w:numId w:val="90"/>
-        </w:numPr>
-        <w:ind w:left="1616" w:hanging="255"/>
-      </w:pPr>
-      <w:r>
-        <w:t>Continuous monitoring with automated alerts replaced manual twice-daily readings.</w:t>
       </w:r>
     </w:p>
     <w:p>
@@ -1277,7 +1008,7 @@
         </w:pBdr>
       </w:pPr>
       <w:r>
-        <w:t>Research Grants &amp; Funding</w:t>
+        <w:t>Key Projects</w:t>
       </w:r>
     </w:p>
     <w:p>
@@ -1289,7 +1020,7 @@
         <w:ind w:left="1361" w:hanging="1361"/>
       </w:pPr>
       <w:r>
-        <w:t>2023 – 2025</w:t>
+        <w:t>2021 – Present</w:t>
       </w:r>
       <w:r>
         <w:tab/>
@@ -1298,14 +1029,14 @@
         <w:rPr>
           <w:b/>
         </w:rPr>
-        <w:t>Seed grant: edge-AI enhancement of aerial imagery</w:t>
+        <w:t>Edge super-resolution pipeline for UAV imagery</w:t>
       </w:r>
       <w:r>
         <w:rPr>
           <w:i/>
           <w:color w:val="4A4A4A"/>
         </w:rPr>
-        <w:t xml:space="preserve"> (Completed)</w:t>
+        <w:t xml:space="preserve"> (Ongoing)</w:t>
       </w:r>
     </w:p>
     <w:p>
@@ -1317,7 +1048,7 @@
         <w:rPr>
           <w:i/>
         </w:rPr>
-        <w:t>Principal investigator, Example Science Foundation (fictional)</w:t>
+        <w:t>Principal investigator, Kestrel Atmospheric Instrumentation Laboratory</w:t>
       </w:r>
     </w:p>
     <w:p>
@@ -1326,7 +1057,7 @@
         <w:ind w:left="1361"/>
       </w:pPr>
       <w:r>
-        <w:t>Two-year seed project on lightweight super-resolution networks for embedded GPUs.</w:t>
+        <w:t>Research prototype that enhances low-resolution UAV video in real time on embedded GPUs using pruned and distilled deep networks.</w:t>
       </w:r>
     </w:p>
     <w:p>
@@ -1338,384 +1069,10 @@
         <w:rPr>
           <w:b/>
         </w:rPr>
-        <w:t xml:space="preserve">Reference: </w:t>
-      </w:r>
-      <w:r>
-        <w:t>ESF/SEED/2023/017</w:t>
-      </w:r>
-    </w:p>
-    <w:p>
-      <w:pPr>
-        <w:spacing w:before="0" w:after="0" w:lineRule="exact" w:line="100"/>
-      </w:pPr>
-      <w:r>
-        <w:rPr>
-          <w:sz w:val="2"/>
-        </w:rPr>
-      </w:r>
-    </w:p>
-    <w:p>
-      <w:pPr>
-        <w:pStyle w:val="Heading1"/>
-        <w:pBdr>
-          <w:bottom w:val="single" w:sz="5" w:space="2" w:color="1D3557"/>
-        </w:pBdr>
-      </w:pPr>
-      <w:r>
-        <w:t>Talks &amp; Presentations</w:t>
-      </w:r>
-    </w:p>
-    <w:p>
-      <w:pPr>
-        <w:pStyle w:val="Heading2"/>
-        <w:tabs>
-          <w:tab w:pos="1361" w:val="left"/>
-        </w:tabs>
-        <w:ind w:left="1361" w:hanging="1361"/>
-      </w:pPr>
-      <w:r>
-        <w:t>2024</w:t>
-      </w:r>
-      <w:r>
-        <w:tab/>
-      </w:r>
-      <w:r>
-        <w:rPr>
-          <w:b/>
-        </w:rPr>
-        <w:t>Invited talk: Edge AI for atmospheric observation</w:t>
-      </w:r>
-    </w:p>
-    <w:p>
-      <w:pPr>
-        <w:pStyle w:val="RISEntrySub"/>
-        <w:ind w:left="1361"/>
-      </w:pPr>
-      <w:r>
-        <w:rPr>
-          <w:i/>
-        </w:rPr>
-        <w:t>Example Symposium on Applied AI</w:t>
-      </w:r>
-    </w:p>
-    <w:p>
-      <w:pPr>
-        <w:spacing w:before="0" w:after="0" w:lineRule="exact" w:line="100"/>
-      </w:pPr>
-      <w:r>
-        <w:rPr>
-          <w:sz w:val="2"/>
-        </w:rPr>
-      </w:r>
-    </w:p>
-    <w:p>
-      <w:pPr>
-        <w:pStyle w:val="Heading1"/>
-        <w:pBdr>
-          <w:bottom w:val="single" w:sz="5" w:space="2" w:color="1D3557"/>
-        </w:pBdr>
-      </w:pPr>
-      <w:r>
-        <w:t>Awards &amp; Honours</w:t>
-      </w:r>
-    </w:p>
-    <w:p>
-      <w:pPr>
-        <w:pStyle w:val="Heading2"/>
-        <w:tabs>
-          <w:tab w:pos="1361" w:val="left"/>
-        </w:tabs>
-        <w:ind w:left="1361" w:hanging="1361"/>
-      </w:pPr>
-      <w:r>
-        <w:t>2023</w:t>
-      </w:r>
-      <w:r>
-        <w:tab/>
-      </w:r>
-      <w:r>
-        <w:rPr>
-          <w:b/>
-        </w:rPr>
-        <w:t>Best Paper Award</w:t>
-      </w:r>
-    </w:p>
-    <w:p>
-      <w:pPr>
-        <w:pStyle w:val="RISEntrySub"/>
-        <w:ind w:left="1361"/>
-      </w:pPr>
-      <w:r>
-        <w:rPr>
-          <w:i/>
-        </w:rPr>
-        <w:t>Example Conference on Instrumentation (ECI 2023)</w:t>
-      </w:r>
-    </w:p>
-    <w:p>
-      <w:pPr>
-        <w:spacing w:before="0" w:after="0" w:lineRule="exact" w:line="100"/>
-      </w:pPr>
-      <w:r>
-        <w:rPr>
-          <w:sz w:val="2"/>
-        </w:rPr>
-      </w:r>
-    </w:p>
-    <w:p>
-      <w:pPr>
-        <w:pStyle w:val="Heading1"/>
-        <w:pBdr>
-          <w:bottom w:val="single" w:sz="5" w:space="2" w:color="1D3557"/>
-        </w:pBdr>
-      </w:pPr>
-      <w:r>
-        <w:t>Professional Service</w:t>
-      </w:r>
-    </w:p>
-    <w:p>
-      <w:pPr>
-        <w:pStyle w:val="Heading2"/>
-        <w:tabs>
-          <w:tab w:pos="1361" w:val="left"/>
-        </w:tabs>
-        <w:ind w:left="1361" w:hanging="1361"/>
-      </w:pPr>
-      <w:r>
-        <w:t>2022 – Present</w:t>
-      </w:r>
-      <w:r>
-        <w:tab/>
-      </w:r>
-      <w:r>
-        <w:rPr>
-          <w:b/>
-        </w:rPr>
-        <w:t>Reviewer, Example Journal of Atmospheric Instrumentation</w:t>
-      </w:r>
-    </w:p>
-    <w:p>
-      <w:pPr>
-        <w:pStyle w:val="RISEntrySub"/>
-        <w:ind w:left="1361"/>
-      </w:pPr>
-      <w:r>
-        <w:rPr>
-          <w:i/>
-        </w:rPr>
-        <w:t>Example Journal of Atmospheric Instrumentation</w:t>
-      </w:r>
-    </w:p>
-    <w:p>
-      <w:pPr>
-        <w:spacing w:before="0" w:after="0" w:lineRule="exact" w:line="100"/>
-      </w:pPr>
-      <w:r>
-        <w:rPr>
-          <w:sz w:val="2"/>
-        </w:rPr>
-      </w:r>
-    </w:p>
-    <w:p>
-      <w:pPr>
-        <w:pStyle w:val="Heading2"/>
-        <w:tabs>
-          <w:tab w:pos="1361" w:val="left"/>
-        </w:tabs>
-        <w:ind w:left="1361" w:hanging="1361"/>
-      </w:pPr>
-      <w:r>
-        <w:t>2024 – 2025</w:t>
-      </w:r>
-      <w:r>
-        <w:tab/>
-      </w:r>
-      <w:r>
-        <w:rPr>
-          <w:b/>
-        </w:rPr>
-        <w:t>Co-supervisor, two M.Tech. dissertations in embedded vision</w:t>
-      </w:r>
-    </w:p>
-    <w:p>
-      <w:pPr>
-        <w:pStyle w:val="RISEntrySub"/>
-        <w:ind w:left="1361"/>
-      </w:pPr>
-      <w:r>
-        <w:rPr>
-          <w:i/>
-        </w:rPr>
-        <w:t>Example Institute of Technology (fictional)</w:t>
-      </w:r>
-    </w:p>
-    <w:p>
-      <w:pPr>
-        <w:spacing w:before="0" w:after="0" w:lineRule="exact" w:line="100"/>
-      </w:pPr>
-      <w:r>
-        <w:rPr>
-          <w:sz w:val="2"/>
-        </w:rPr>
-      </w:r>
-    </w:p>
-    <w:p>
-      <w:pPr>
-        <w:pStyle w:val="Heading1"/>
-        <w:pBdr>
-          <w:bottom w:val="single" w:sz="5" w:space="2" w:color="1D3557"/>
-        </w:pBdr>
-      </w:pPr>
-      <w:r>
-        <w:t>Professional Memberships</w:t>
-      </w:r>
-    </w:p>
-    <w:p>
-      <w:pPr>
-        <w:pStyle w:val="Heading2"/>
-        <w:tabs>
-          <w:tab w:pos="1361" w:val="left"/>
-        </w:tabs>
-        <w:ind w:left="1361" w:hanging="1361"/>
-      </w:pPr>
-      <w:r>
-        <w:t>2010 – Present</w:t>
-      </w:r>
-      <w:r>
-        <w:tab/>
-      </w:r>
-      <w:r>
-        <w:rPr>
-          <w:b/>
-        </w:rPr>
-        <w:t>Member, Institution of Example Engineers</w:t>
-      </w:r>
-    </w:p>
-    <w:p>
-      <w:pPr>
-        <w:pStyle w:val="RISEntrySub"/>
-        <w:ind w:left="1361"/>
-      </w:pPr>
-      <w:r>
-        <w:rPr>
-          <w:i/>
-        </w:rPr>
-        <w:t>Institution of Example Engineers</w:t>
-      </w:r>
-    </w:p>
-    <w:p>
-      <w:pPr>
-        <w:spacing w:before="0" w:after="0" w:lineRule="exact" w:line="100"/>
-      </w:pPr>
-      <w:r>
-        <w:rPr>
-          <w:sz w:val="2"/>
-        </w:rPr>
-      </w:r>
-    </w:p>
-    <w:p>
-      <w:pPr>
-        <w:pStyle w:val="Heading1"/>
-        <w:pBdr>
-          <w:bottom w:val="single" w:sz="5" w:space="2" w:color="1D3557"/>
-        </w:pBdr>
-      </w:pPr>
-      <w:r>
-        <w:t>Service &amp; Leadership</w:t>
-      </w:r>
-    </w:p>
-    <w:p>
-      <w:pPr>
-        <w:pStyle w:val="Heading2"/>
-        <w:tabs>
-          <w:tab w:pos="1361" w:val="left"/>
-        </w:tabs>
-        <w:ind w:left="1361" w:hanging="1361"/>
-      </w:pPr>
-      <w:r>
-        <w:t>2022 – Present</w:t>
-      </w:r>
-      <w:r>
-        <w:tab/>
-      </w:r>
-      <w:r>
-        <w:rPr>
-          <w:b/>
-        </w:rPr>
-        <w:t>Supervisor, M.Tech. interns in applied machine learning</w:t>
-      </w:r>
-    </w:p>
-    <w:p>
-      <w:pPr>
-        <w:pStyle w:val="RISEntrySub"/>
-        <w:ind w:left="1361"/>
-      </w:pPr>
-      <w:r>
-        <w:rPr>
-          <w:i/>
-        </w:rPr>
-        <w:t>Kestrel Atmospheric Instrumentation Laboratory</w:t>
-      </w:r>
-    </w:p>
-    <w:p>
-      <w:pPr>
-        <w:pStyle w:val="RISBody"/>
-        <w:ind w:left="1361"/>
-      </w:pPr>
-      <w:r>
-        <w:t>Supervise summer and dissertation interns on edge-AI projects.</w:t>
-      </w:r>
-    </w:p>
-    <w:p>
-      <w:pPr>
-        <w:spacing w:before="0" w:after="0" w:lineRule="exact" w:line="100"/>
-      </w:pPr>
-      <w:r>
-        <w:rPr>
-          <w:sz w:val="2"/>
-        </w:rPr>
-      </w:r>
-    </w:p>
-    <w:p>
-      <w:pPr>
-        <w:pStyle w:val="Heading2"/>
-        <w:tabs>
-          <w:tab w:pos="1361" w:val="left"/>
-        </w:tabs>
-        <w:ind w:left="1361" w:hanging="1361"/>
-      </w:pPr>
-      <w:r>
-        <w:t>2023 – 2024</w:t>
-      </w:r>
-      <w:r>
-        <w:tab/>
-      </w:r>
-      <w:r>
-        <w:rPr>
-          <w:b/>
-        </w:rPr>
-        <w:t>Chair, Technical Evaluation Committee for radiosonde procurement</w:t>
-      </w:r>
-    </w:p>
-    <w:p>
-      <w:pPr>
-        <w:pStyle w:val="RISEntrySub"/>
-        <w:ind w:left="1361"/>
-      </w:pPr>
-      <w:r>
-        <w:rPr>
-          <w:i/>
-        </w:rPr>
-        <w:t>Kestrel Atmospheric Instrumentation Laboratory</w:t>
-      </w:r>
-    </w:p>
-    <w:p>
-      <w:pPr>
-        <w:pStyle w:val="RISBody"/>
-        <w:ind w:left="1361"/>
-      </w:pPr>
-      <w:r>
-        <w:t>Chaired technical evaluation of bids for upper-air sounding systems.</w:t>
+        <w:t xml:space="preserve">Technologies: </w:t>
+      </w:r>
+      <w:r>
+        <w:t>NVIDIA Jetson Xavier NX, NVIDIA Jetson Orin Nano, PyTorch, TensorRT, ONNX, Docker, Structured pruning, Knowledge distillation, INT8 quantisation</w:t>
       </w:r>
     </w:p>
     <w:p>
@@ -1728,7 +1085,20 @@
         <w:ind w:left="1616" w:hanging="255"/>
       </w:pPr>
       <w:r>
-        <w:t>Evaluation report accepted by the competent authority.</w:t>
+        <w:t>Implemented structured channel pruning and knowledge distillation to shrink the super-resolution network for embedded deployment.</w:t>
+      </w:r>
+    </w:p>
+    <w:p>
+      <w:pPr>
+        <w:pStyle w:val="RISBullet"/>
+        <w:numPr>
+          <w:ilvl w:val="0"/>
+          <w:numId w:val="90"/>
+        </w:numPr>
+        <w:ind w:left="1616" w:hanging="255"/>
+      </w:pPr>
+      <w:r>
+        <w:t>Converted models through ONNX to INT8 TensorRT engines, achieving 3.1× faster inference on Jetson Xavier NX.</w:t>
       </w:r>
     </w:p>
     <w:p>
@@ -1739,17 +1109,6 @@
         <w:rPr>
           <w:sz w:val="2"/>
         </w:rPr>
-      </w:r>
-    </w:p>
-    <w:p>
-      <w:pPr>
-        <w:pStyle w:val="Heading1"/>
-        <w:pBdr>
-          <w:bottom w:val="single" w:sz="5" w:space="2" w:color="1D3557"/>
-        </w:pBdr>
-      </w:pPr>
-      <w:r>
-        <w:t>Certifications &amp; Licences</w:t>
       </w:r>
     </w:p>
     <w:p>
@@ -1761,7 +1120,7 @@
         <w:ind w:left="1361" w:hanging="1361"/>
       </w:pPr>
       <w:r>
-        <w:t>2022</w:t>
+        <w:t>2018 – 2019</w:t>
       </w:r>
       <w:r>
         <w:tab/>
@@ -1770,7 +1129,7 @@
         <w:rPr>
           <w:b/>
         </w:rPr>
-        <w:t>Deep Learning for Edge Devices</w:t>
+        <w:t>Radiosonde ground-station acceptance test protocol</w:t>
       </w:r>
     </w:p>
     <w:p>
@@ -1782,7 +1141,7 @@
         <w:rPr>
           <w:i/>
         </w:rPr>
-        <w:t>Example Academy of Applied Computing</w:t>
+        <w:t>Coordinator</w:t>
       </w:r>
     </w:p>
     <w:p>
@@ -1791,82 +1150,20 @@
         <w:ind w:left="1361"/>
       </w:pPr>
       <w:r>
-        <w:t>Used the model-compression techniques to deploy the drone super-resolution model on Jetson modules.</w:t>
+        <w:t>Station acceptance testing varied between sites.</w:t>
       </w:r>
     </w:p>
     <w:p>
       <w:pPr>
-        <w:pStyle w:val="RISMeta"/>
-        <w:ind w:left="1361"/>
-      </w:pPr>
-      <w:r>
-        <w:rPr>
-          <w:b/>
-        </w:rPr>
-        <w:t xml:space="preserve">Duration: </w:t>
-      </w:r>
-      <w:r>
-        <w:t>40 hours</w:t>
-      </w:r>
-    </w:p>
-    <w:p>
-      <w:pPr>
-        <w:pStyle w:val="RISMeta"/>
-        <w:ind w:left="1361"/>
-      </w:pPr>
-      <w:r>
-        <w:rPr>
-          <w:b/>
-        </w:rPr>
-        <w:t xml:space="preserve">Credential: </w:t>
-      </w:r>
-      <w:r>
-        <w:t>EAAC-DL-0042</w:t>
-      </w:r>
-    </w:p>
-    <w:p>
-      <w:pPr>
-        <w:pStyle w:val="RISMeta"/>
-        <w:ind w:left="1361"/>
-      </w:pPr>
-      <w:r>
-        <w:rPr>
-          <w:b/>
-        </w:rPr>
-        <w:t xml:space="preserve">Valid until: </w:t>
-      </w:r>
-      <w:r>
-        <w:t>2029</w:t>
-      </w:r>
-    </w:p>
-    <w:p>
-      <w:pPr>
-        <w:pStyle w:val="RISMeta"/>
-        <w:ind w:left="1361"/>
-      </w:pPr>
-      <w:r>
-        <w:rPr>
-          <w:b/>
-        </w:rPr>
-        <w:t xml:space="preserve">Mode: </w:t>
-      </w:r>
-      <w:r>
-        <w:t>Online</w:t>
-      </w:r>
-    </w:p>
-    <w:p>
-      <w:pPr>
-        <w:pStyle w:val="RISMeta"/>
-        <w:ind w:left="1361"/>
-      </w:pPr>
-      <w:r>
-        <w:rPr>
-          <w:b/>
-        </w:rPr>
-        <w:t xml:space="preserve">Skills: </w:t>
-      </w:r>
-      <w:r>
-        <w:t>Deep learning, Edge AI, TensorRT</w:t>
+        <w:pStyle w:val="RISBullet"/>
+        <w:numPr>
+          <w:ilvl w:val="0"/>
+          <w:numId w:val="90"/>
+        </w:numPr>
+        <w:ind w:left="1616" w:hanging="255"/>
+      </w:pPr>
+      <w:r>
+        <w:t>A common acceptance protocol and checklist adopted for new ground-receiving systems.</w:t>
       </w:r>
     </w:p>
     <w:p>
@@ -1888,6 +1185,709 @@
         <w:ind w:left="1361" w:hanging="1361"/>
       </w:pPr>
       <w:r>
+        <w:t>2020 – 2022</w:t>
+      </w:r>
+      <w:r>
+        <w:tab/>
+      </w:r>
+      <w:r>
+        <w:rPr>
+          <w:b/>
+        </w:rPr>
+        <w:t>IoT monitoring of laboratory infrastructure</w:t>
+      </w:r>
+    </w:p>
+    <w:p>
+      <w:pPr>
+        <w:pStyle w:val="RISEntrySub"/>
+        <w:ind w:left="1361"/>
+      </w:pPr>
+      <w:r>
+        <w:rPr>
+          <w:i/>
+        </w:rPr>
+        <w:t>Project lead</w:t>
+      </w:r>
+    </w:p>
+    <w:p>
+      <w:pPr>
+        <w:pStyle w:val="RISBody"/>
+        <w:ind w:left="1361"/>
+      </w:pPr>
+      <w:r>
+        <w:t>Instrument rooms lacked continuous environmental and power-quality monitoring.</w:t>
+      </w:r>
+    </w:p>
+    <w:p>
+      <w:pPr>
+        <w:pStyle w:val="RISMeta"/>
+        <w:ind w:left="1361"/>
+      </w:pPr>
+      <w:r>
+        <w:rPr>
+          <w:b/>
+        </w:rPr>
+        <w:t xml:space="preserve">Technologies: </w:t>
+      </w:r>
+      <w:r>
+        <w:t>ESP32, Environmental sensors, MQTT, Node-RED, InfluxDB, Grafana</w:t>
+      </w:r>
+    </w:p>
+    <w:p>
+      <w:pPr>
+        <w:pStyle w:val="RISBullet"/>
+        <w:numPr>
+          <w:ilvl w:val="0"/>
+          <w:numId w:val="90"/>
+        </w:numPr>
+        <w:ind w:left="1616" w:hanging="255"/>
+      </w:pPr>
+      <w:r>
+        <w:t>Deployed ESP32 sensor nodes publishing over MQTT to a Node-RED flow, InfluxDB time-series storage and Grafana dashboards with threshold alerts.</w:t>
+      </w:r>
+    </w:p>
+    <w:p>
+      <w:pPr>
+        <w:pStyle w:val="RISBullet"/>
+        <w:numPr>
+          <w:ilvl w:val="0"/>
+          <w:numId w:val="90"/>
+        </w:numPr>
+        <w:ind w:left="1616" w:hanging="255"/>
+      </w:pPr>
+      <w:r>
+        <w:t>Continuous monitoring with automated alerts replaced manual twice-daily readings.</w:t>
+      </w:r>
+    </w:p>
+    <w:p>
+      <w:pPr>
+        <w:spacing w:before="0" w:after="0" w:lineRule="exact" w:line="100"/>
+      </w:pPr>
+      <w:r>
+        <w:rPr>
+          <w:sz w:val="2"/>
+        </w:rPr>
+      </w:r>
+    </w:p>
+    <w:p>
+      <w:pPr>
+        <w:pStyle w:val="Heading1"/>
+        <w:pBdr>
+          <w:bottom w:val="single" w:sz="5" w:space="2" w:color="1D3557"/>
+        </w:pBdr>
+      </w:pPr>
+      <w:r>
+        <w:t>Research Grants &amp; Funding</w:t>
+      </w:r>
+    </w:p>
+    <w:p>
+      <w:pPr>
+        <w:pStyle w:val="Heading2"/>
+        <w:tabs>
+          <w:tab w:pos="1361" w:val="left"/>
+        </w:tabs>
+        <w:ind w:left="1361" w:hanging="1361"/>
+      </w:pPr>
+      <w:r>
+        <w:t>2023 – 2025</w:t>
+      </w:r>
+      <w:r>
+        <w:tab/>
+      </w:r>
+      <w:r>
+        <w:rPr>
+          <w:b/>
+        </w:rPr>
+        <w:t>Seed grant: edge-AI enhancement of aerial imagery</w:t>
+      </w:r>
+      <w:r>
+        <w:rPr>
+          <w:i/>
+          <w:color w:val="4A4A4A"/>
+        </w:rPr>
+        <w:t xml:space="preserve"> (Completed)</w:t>
+      </w:r>
+    </w:p>
+    <w:p>
+      <w:pPr>
+        <w:pStyle w:val="RISEntrySub"/>
+        <w:ind w:left="1361"/>
+      </w:pPr>
+      <w:r>
+        <w:rPr>
+          <w:i/>
+        </w:rPr>
+        <w:t>Principal investigator, Example Science Foundation (fictional)</w:t>
+      </w:r>
+    </w:p>
+    <w:p>
+      <w:pPr>
+        <w:pStyle w:val="RISBody"/>
+        <w:ind w:left="1361"/>
+      </w:pPr>
+      <w:r>
+        <w:t>Two-year seed project on lightweight super-resolution networks for embedded GPUs.</w:t>
+      </w:r>
+    </w:p>
+    <w:p>
+      <w:pPr>
+        <w:pStyle w:val="RISMeta"/>
+        <w:ind w:left="1361"/>
+      </w:pPr>
+      <w:r>
+        <w:rPr>
+          <w:b/>
+        </w:rPr>
+        <w:t xml:space="preserve">Reference: </w:t>
+      </w:r>
+      <w:r>
+        <w:t>ESF/SEED/2023/017</w:t>
+      </w:r>
+    </w:p>
+    <w:p>
+      <w:pPr>
+        <w:spacing w:before="0" w:after="0" w:lineRule="exact" w:line="100"/>
+      </w:pPr>
+      <w:r>
+        <w:rPr>
+          <w:sz w:val="2"/>
+        </w:rPr>
+      </w:r>
+    </w:p>
+    <w:p>
+      <w:pPr>
+        <w:pStyle w:val="Heading1"/>
+        <w:pBdr>
+          <w:bottom w:val="single" w:sz="5" w:space="2" w:color="1D3557"/>
+        </w:pBdr>
+      </w:pPr>
+      <w:r>
+        <w:t>Talks &amp; Presentations</w:t>
+      </w:r>
+    </w:p>
+    <w:p>
+      <w:pPr>
+        <w:pStyle w:val="Heading2"/>
+        <w:tabs>
+          <w:tab w:pos="1361" w:val="left"/>
+        </w:tabs>
+        <w:ind w:left="1361" w:hanging="1361"/>
+      </w:pPr>
+      <w:r>
+        <w:t>2024</w:t>
+      </w:r>
+      <w:r>
+        <w:tab/>
+      </w:r>
+      <w:r>
+        <w:rPr>
+          <w:b/>
+        </w:rPr>
+        <w:t>Invited talk: Edge AI for atmospheric observation</w:t>
+      </w:r>
+    </w:p>
+    <w:p>
+      <w:pPr>
+        <w:pStyle w:val="RISEntrySub"/>
+        <w:ind w:left="1361"/>
+      </w:pPr>
+      <w:r>
+        <w:rPr>
+          <w:i/>
+        </w:rPr>
+        <w:t>Example Symposium on Applied AI</w:t>
+      </w:r>
+    </w:p>
+    <w:p>
+      <w:pPr>
+        <w:spacing w:before="0" w:after="0" w:lineRule="exact" w:line="100"/>
+      </w:pPr>
+      <w:r>
+        <w:rPr>
+          <w:sz w:val="2"/>
+        </w:rPr>
+      </w:r>
+    </w:p>
+    <w:p>
+      <w:pPr>
+        <w:pStyle w:val="Heading1"/>
+        <w:pBdr>
+          <w:bottom w:val="single" w:sz="5" w:space="2" w:color="1D3557"/>
+        </w:pBdr>
+      </w:pPr>
+      <w:r>
+        <w:t>Awards &amp; Honours</w:t>
+      </w:r>
+    </w:p>
+    <w:p>
+      <w:pPr>
+        <w:pStyle w:val="Heading2"/>
+        <w:tabs>
+          <w:tab w:pos="1361" w:val="left"/>
+        </w:tabs>
+        <w:ind w:left="1361" w:hanging="1361"/>
+      </w:pPr>
+      <w:r>
+        <w:t>2023</w:t>
+      </w:r>
+      <w:r>
+        <w:tab/>
+      </w:r>
+      <w:r>
+        <w:rPr>
+          <w:b/>
+        </w:rPr>
+        <w:t>Best Paper Award</w:t>
+      </w:r>
+    </w:p>
+    <w:p>
+      <w:pPr>
+        <w:pStyle w:val="RISEntrySub"/>
+        <w:ind w:left="1361"/>
+      </w:pPr>
+      <w:r>
+        <w:rPr>
+          <w:i/>
+        </w:rPr>
+        <w:t>Example Conference on Instrumentation (ECI 2023)</w:t>
+      </w:r>
+    </w:p>
+    <w:p>
+      <w:pPr>
+        <w:spacing w:before="0" w:after="0" w:lineRule="exact" w:line="100"/>
+      </w:pPr>
+      <w:r>
+        <w:rPr>
+          <w:sz w:val="2"/>
+        </w:rPr>
+      </w:r>
+    </w:p>
+    <w:p>
+      <w:pPr>
+        <w:pStyle w:val="Heading1"/>
+        <w:pBdr>
+          <w:bottom w:val="single" w:sz="5" w:space="2" w:color="1D3557"/>
+        </w:pBdr>
+      </w:pPr>
+      <w:r>
+        <w:t>Professional Service</w:t>
+      </w:r>
+    </w:p>
+    <w:p>
+      <w:pPr>
+        <w:pStyle w:val="Heading2"/>
+        <w:tabs>
+          <w:tab w:pos="1361" w:val="left"/>
+        </w:tabs>
+        <w:ind w:left="1361" w:hanging="1361"/>
+      </w:pPr>
+      <w:r>
+        <w:t>2022 – Present</w:t>
+      </w:r>
+      <w:r>
+        <w:tab/>
+      </w:r>
+      <w:r>
+        <w:rPr>
+          <w:b/>
+        </w:rPr>
+        <w:t>Reviewer, Example Journal of Atmospheric Instrumentation</w:t>
+      </w:r>
+    </w:p>
+    <w:p>
+      <w:pPr>
+        <w:pStyle w:val="RISEntrySub"/>
+        <w:ind w:left="1361"/>
+      </w:pPr>
+      <w:r>
+        <w:rPr>
+          <w:i/>
+        </w:rPr>
+        <w:t>Example Journal of Atmospheric Instrumentation</w:t>
+      </w:r>
+    </w:p>
+    <w:p>
+      <w:pPr>
+        <w:spacing w:before="0" w:after="0" w:lineRule="exact" w:line="100"/>
+      </w:pPr>
+      <w:r>
+        <w:rPr>
+          <w:sz w:val="2"/>
+        </w:rPr>
+      </w:r>
+    </w:p>
+    <w:p>
+      <w:pPr>
+        <w:pStyle w:val="Heading2"/>
+        <w:tabs>
+          <w:tab w:pos="1361" w:val="left"/>
+        </w:tabs>
+        <w:ind w:left="1361" w:hanging="1361"/>
+      </w:pPr>
+      <w:r>
+        <w:t>2024 – 2025</w:t>
+      </w:r>
+      <w:r>
+        <w:tab/>
+      </w:r>
+      <w:r>
+        <w:rPr>
+          <w:b/>
+        </w:rPr>
+        <w:t>Co-supervisor, two M.Tech. dissertations in embedded vision</w:t>
+      </w:r>
+    </w:p>
+    <w:p>
+      <w:pPr>
+        <w:pStyle w:val="RISEntrySub"/>
+        <w:ind w:left="1361"/>
+      </w:pPr>
+      <w:r>
+        <w:rPr>
+          <w:i/>
+        </w:rPr>
+        <w:t>Example Institute of Technology (fictional)</w:t>
+      </w:r>
+    </w:p>
+    <w:p>
+      <w:pPr>
+        <w:spacing w:before="0" w:after="0" w:lineRule="exact" w:line="100"/>
+      </w:pPr>
+      <w:r>
+        <w:rPr>
+          <w:sz w:val="2"/>
+        </w:rPr>
+      </w:r>
+    </w:p>
+    <w:p>
+      <w:pPr>
+        <w:pStyle w:val="Heading1"/>
+        <w:pBdr>
+          <w:bottom w:val="single" w:sz="5" w:space="2" w:color="1D3557"/>
+        </w:pBdr>
+      </w:pPr>
+      <w:r>
+        <w:t>Professional Memberships</w:t>
+      </w:r>
+    </w:p>
+    <w:p>
+      <w:pPr>
+        <w:pStyle w:val="Heading2"/>
+        <w:tabs>
+          <w:tab w:pos="1361" w:val="left"/>
+        </w:tabs>
+        <w:ind w:left="1361" w:hanging="1361"/>
+      </w:pPr>
+      <w:r>
+        <w:t>2010 – Present</w:t>
+      </w:r>
+      <w:r>
+        <w:tab/>
+      </w:r>
+      <w:r>
+        <w:rPr>
+          <w:b/>
+        </w:rPr>
+        <w:t>Member, Institution of Example Engineers</w:t>
+      </w:r>
+    </w:p>
+    <w:p>
+      <w:pPr>
+        <w:pStyle w:val="RISEntrySub"/>
+        <w:ind w:left="1361"/>
+      </w:pPr>
+      <w:r>
+        <w:rPr>
+          <w:i/>
+        </w:rPr>
+        <w:t>Institution of Example Engineers</w:t>
+      </w:r>
+    </w:p>
+    <w:p>
+      <w:pPr>
+        <w:spacing w:before="0" w:after="0" w:lineRule="exact" w:line="100"/>
+      </w:pPr>
+      <w:r>
+        <w:rPr>
+          <w:sz w:val="2"/>
+        </w:rPr>
+      </w:r>
+    </w:p>
+    <w:p>
+      <w:pPr>
+        <w:pStyle w:val="Heading1"/>
+        <w:pBdr>
+          <w:bottom w:val="single" w:sz="5" w:space="2" w:color="1D3557"/>
+        </w:pBdr>
+      </w:pPr>
+      <w:r>
+        <w:t>Service &amp; Leadership</w:t>
+      </w:r>
+    </w:p>
+    <w:p>
+      <w:pPr>
+        <w:pStyle w:val="Heading2"/>
+        <w:tabs>
+          <w:tab w:pos="1361" w:val="left"/>
+        </w:tabs>
+        <w:ind w:left="1361" w:hanging="1361"/>
+      </w:pPr>
+      <w:r>
+        <w:t>2022 – Present</w:t>
+      </w:r>
+      <w:r>
+        <w:tab/>
+      </w:r>
+      <w:r>
+        <w:rPr>
+          <w:b/>
+        </w:rPr>
+        <w:t>Supervisor, M.Tech. interns in applied machine learning</w:t>
+      </w:r>
+    </w:p>
+    <w:p>
+      <w:pPr>
+        <w:pStyle w:val="RISEntrySub"/>
+        <w:ind w:left="1361"/>
+      </w:pPr>
+      <w:r>
+        <w:rPr>
+          <w:i/>
+        </w:rPr>
+        <w:t>Kestrel Atmospheric Instrumentation Laboratory</w:t>
+      </w:r>
+    </w:p>
+    <w:p>
+      <w:pPr>
+        <w:pStyle w:val="RISBody"/>
+        <w:ind w:left="1361"/>
+      </w:pPr>
+      <w:r>
+        <w:t>Supervise summer and dissertation interns on edge-AI projects.</w:t>
+      </w:r>
+    </w:p>
+    <w:p>
+      <w:pPr>
+        <w:spacing w:before="0" w:after="0" w:lineRule="exact" w:line="100"/>
+      </w:pPr>
+      <w:r>
+        <w:rPr>
+          <w:sz w:val="2"/>
+        </w:rPr>
+      </w:r>
+    </w:p>
+    <w:p>
+      <w:pPr>
+        <w:pStyle w:val="Heading2"/>
+        <w:tabs>
+          <w:tab w:pos="1361" w:val="left"/>
+        </w:tabs>
+        <w:ind w:left="1361" w:hanging="1361"/>
+      </w:pPr>
+      <w:r>
+        <w:t>2023 – 2024</w:t>
+      </w:r>
+      <w:r>
+        <w:tab/>
+      </w:r>
+      <w:r>
+        <w:rPr>
+          <w:b/>
+        </w:rPr>
+        <w:t>Chair, Technical Evaluation Committee for radiosonde procurement</w:t>
+      </w:r>
+    </w:p>
+    <w:p>
+      <w:pPr>
+        <w:pStyle w:val="RISEntrySub"/>
+        <w:ind w:left="1361"/>
+      </w:pPr>
+      <w:r>
+        <w:rPr>
+          <w:i/>
+        </w:rPr>
+        <w:t>Kestrel Atmospheric Instrumentation Laboratory</w:t>
+      </w:r>
+    </w:p>
+    <w:p>
+      <w:pPr>
+        <w:pStyle w:val="RISBody"/>
+        <w:ind w:left="1361"/>
+      </w:pPr>
+      <w:r>
+        <w:t>Chaired technical evaluation of bids for upper-air sounding systems.</w:t>
+      </w:r>
+    </w:p>
+    <w:p>
+      <w:pPr>
+        <w:pStyle w:val="RISBullet"/>
+        <w:numPr>
+          <w:ilvl w:val="0"/>
+          <w:numId w:val="90"/>
+        </w:numPr>
+        <w:ind w:left="1616" w:hanging="255"/>
+      </w:pPr>
+      <w:r>
+        <w:t>Evaluation report accepted by the competent authority.</w:t>
+      </w:r>
+    </w:p>
+    <w:p>
+      <w:pPr>
+        <w:spacing w:before="0" w:after="0" w:lineRule="exact" w:line="100"/>
+      </w:pPr>
+      <w:r>
+        <w:rPr>
+          <w:sz w:val="2"/>
+        </w:rPr>
+      </w:r>
+    </w:p>
+    <w:p>
+      <w:pPr>
+        <w:pStyle w:val="Heading1"/>
+        <w:pBdr>
+          <w:bottom w:val="single" w:sz="5" w:space="2" w:color="1D3557"/>
+        </w:pBdr>
+      </w:pPr>
+      <w:r>
+        <w:t>Certifications &amp; Licences</w:t>
+      </w:r>
+    </w:p>
+    <w:p>
+      <w:pPr>
+        <w:pStyle w:val="Heading2"/>
+        <w:tabs>
+          <w:tab w:pos="1361" w:val="left"/>
+        </w:tabs>
+        <w:ind w:left="1361" w:hanging="1361"/>
+      </w:pPr>
+      <w:r>
+        <w:t>2022</w:t>
+      </w:r>
+      <w:r>
+        <w:tab/>
+      </w:r>
+      <w:r>
+        <w:rPr>
+          <w:b/>
+        </w:rPr>
+        <w:t>Deep Learning for Edge Devices</w:t>
+      </w:r>
+    </w:p>
+    <w:p>
+      <w:pPr>
+        <w:pStyle w:val="RISEntrySub"/>
+        <w:ind w:left="1361"/>
+      </w:pPr>
+      <w:r>
+        <w:rPr>
+          <w:i/>
+        </w:rPr>
+        <w:t>Example Academy of Applied Computing</w:t>
+      </w:r>
+    </w:p>
+    <w:p>
+      <w:pPr>
+        <w:pStyle w:val="RISBody"/>
+        <w:ind w:left="1361"/>
+      </w:pPr>
+      <w:r>
+        <w:t>Used the model-compression techniques to deploy the drone super-resolution model on Jetson modules.</w:t>
+      </w:r>
+    </w:p>
+    <w:p>
+      <w:pPr>
+        <w:pStyle w:val="RISMeta"/>
+        <w:ind w:left="1361"/>
+      </w:pPr>
+      <w:r>
+        <w:rPr>
+          <w:b/>
+        </w:rPr>
+        <w:t xml:space="preserve">Duration: </w:t>
+      </w:r>
+      <w:r>
+        <w:t>40 hours</w:t>
+      </w:r>
+    </w:p>
+    <w:p>
+      <w:pPr>
+        <w:pStyle w:val="RISMeta"/>
+        <w:ind w:left="1361"/>
+      </w:pPr>
+      <w:r>
+        <w:rPr>
+          <w:b/>
+        </w:rPr>
+        <w:t xml:space="preserve">Credential: </w:t>
+      </w:r>
+      <w:r>
+        <w:t>EAAC-DL-0042</w:t>
+      </w:r>
+    </w:p>
+    <w:p>
+      <w:pPr>
+        <w:pStyle w:val="RISMeta"/>
+        <w:ind w:left="1361"/>
+      </w:pPr>
+      <w:r>
+        <w:rPr>
+          <w:b/>
+        </w:rPr>
+        <w:t xml:space="preserve">Valid until: </w:t>
+      </w:r>
+      <w:r>
+        <w:t>2029</w:t>
+      </w:r>
+    </w:p>
+    <w:p>
+      <w:pPr>
+        <w:pStyle w:val="RISMeta"/>
+        <w:ind w:left="1361"/>
+      </w:pPr>
+      <w:r>
+        <w:rPr>
+          <w:b/>
+        </w:rPr>
+        <w:t xml:space="preserve">Mode: </w:t>
+      </w:r>
+      <w:r>
+        <w:t>Online</w:t>
+      </w:r>
+    </w:p>
+    <w:p>
+      <w:pPr>
+        <w:pStyle w:val="RISMeta"/>
+        <w:ind w:left="1361"/>
+      </w:pPr>
+      <w:r>
+        <w:rPr>
+          <w:b/>
+        </w:rPr>
+        <w:t xml:space="preserve">Skills: </w:t>
+      </w:r>
+      <w:r>
+        <w:t>Deep learning, Edge AI, TensorRT</w:t>
+      </w:r>
+    </w:p>
+    <w:p>
+      <w:pPr>
+        <w:spacing w:before="0" w:after="0" w:lineRule="exact" w:line="100"/>
+      </w:pPr>
+      <w:r>
+        <w:rPr>
+          <w:sz w:val="2"/>
+        </w:rPr>
+      </w:r>
+    </w:p>
+    <w:p>
+      <w:pPr>
+        <w:pStyle w:val="Heading2"/>
+        <w:tabs>
+          <w:tab w:pos="1361" w:val="left"/>
+        </w:tabs>
+        <w:ind w:left="1361" w:hanging="1361"/>
+      </w:pPr>
+      <w:r>
         <w:t>2016</w:t>
       </w:r>
       <w:r>
@@ -2220,7 +2220,7 @@
         <w:ind w:left="1361" w:hanging="1361"/>
       </w:pPr>
       <w:r>
-        <w:t>2019</w:t>
+        <w:t>2020</w:t>
       </w:r>
       <w:r>
         <w:tab/>
@@ -2229,7 +2229,7 @@
         <w:rPr>
           <w:b/>
         </w:rPr>
-        <w:t>Public Procurement and GFR 2017</w:t>
+        <w:t>Mid-Career Training Programme for Scientists</w:t>
       </w:r>
     </w:p>
     <w:p>
@@ -2241,7 +2241,7 @@
         <w:rPr>
           <w:i/>
         </w:rPr>
-        <w:t>Example Institute of Public Administration (sponsored by Kestrel Atmospheric Instrumentation Laboratory)</w:t>
+        <w:t>Example Institute of Scientific Administration (sponsored by Ministry of Example Sciences)</w:t>
       </w:r>
     </w:p>
     <w:p>
@@ -2256,22 +2256,7 @@
         <w:t xml:space="preserve">Duration: </w:t>
       </w:r>
       <w:r>
-        <w:t>5 days</w:t>
-      </w:r>
-    </w:p>
-    <w:p>
-      <w:pPr>
-        <w:pStyle w:val="RISMeta"/>
-        <w:ind w:left="1361"/>
-      </w:pPr>
-      <w:r>
-        <w:rPr>
-          <w:b/>
-        </w:rPr>
-        <w:t xml:space="preserve">Skills: </w:t>
-      </w:r>
-      <w:r>
-        <w:t>Public procurement, GFR 2017, GeM</w:t>
+        <w:t>10 days</w:t>
       </w:r>
     </w:p>
     <w:p>
@@ -2293,7 +2278,7 @@
         <w:ind w:left="1361" w:hanging="1361"/>
       </w:pPr>
       <w:r>
-        <w:t>2020</w:t>
+        <w:t>2019</w:t>
       </w:r>
       <w:r>
         <w:tab/>
@@ -2302,7 +2287,7 @@
         <w:rPr>
           <w:b/>
         </w:rPr>
-        <w:t>Mid-Career Training Programme for Scientists</w:t>
+        <w:t>Public Procurement and GFR 2017</w:t>
       </w:r>
     </w:p>
     <w:p>
@@ -2314,7 +2299,7 @@
         <w:rPr>
           <w:i/>
         </w:rPr>
-        <w:t>Example Institute of Scientific Administration (sponsored by Ministry of Example Sciences)</w:t>
+        <w:t>Example Institute of Public Administration (sponsored by Kestrel Atmospheric Instrumentation Laboratory)</w:t>
       </w:r>
     </w:p>
     <w:p>
@@ -2329,7 +2314,22 @@
         <w:t xml:space="preserve">Duration: </w:t>
       </w:r>
       <w:r>
-        <w:t>10 days</w:t>
+        <w:t>5 days</w:t>
+      </w:r>
+    </w:p>
+    <w:p>
+      <w:pPr>
+        <w:pStyle w:val="RISMeta"/>
+        <w:ind w:left="1361"/>
+      </w:pPr>
+      <w:r>
+        <w:rPr>
+          <w:b/>
+        </w:rPr>
+        <w:t xml:space="preserve">Skills: </w:t>
+      </w:r>
+      <w:r>
+        <w:t>Public procurement, GFR 2017, GeM</w:t>
       </w:r>
     </w:p>
     <w:p>
@@ -2407,10 +2407,10 @@
         <w:rPr>
           <w:b/>
         </w:rPr>
-        <w:t xml:space="preserve">Computer vision: </w:t>
-      </w:r>
-      <w:r>
-        <w:t>Image super-resolution, Object detection</w:t>
+        <w:t xml:space="preserve">Edge AI: </w:t>
+      </w:r>
+      <w:r>
+        <w:t>NVIDIA Jetson deployment</w:t>
       </w:r>
     </w:p>
     <w:p>
@@ -2437,10 +2437,10 @@
         <w:rPr>
           <w:b/>
         </w:rPr>
-        <w:t xml:space="preserve">Edge AI: </w:t>
-      </w:r>
-      <w:r>
-        <w:t>NVIDIA Jetson deployment</w:t>
+        <w:t xml:space="preserve">AI / machine learning: </w:t>
+      </w:r>
+      <w:r>
+        <w:t>PyTorch, Deep learning</w:t>
       </w:r>
     </w:p>
     <w:p>
@@ -2452,10 +2452,85 @@
         <w:rPr>
           <w:b/>
         </w:rPr>
-        <w:t xml:space="preserve">AI / machine learning: </w:t>
-      </w:r>
-      <w:r>
-        <w:t>Deep learning, PyTorch</w:t>
+        <w:t xml:space="preserve">IoT: </w:t>
+      </w:r>
+      <w:r>
+        <w:t>MQTT and Node-RED, InfluxDB and Grafana</w:t>
+      </w:r>
+    </w:p>
+    <w:p>
+      <w:pPr>
+        <w:pStyle w:val="RISBody"/>
+        <w:spacing w:after="30"/>
+      </w:pPr>
+      <w:r>
+        <w:rPr>
+          <w:b/>
+        </w:rPr>
+        <w:t xml:space="preserve">Computer vision: </w:t>
+      </w:r>
+      <w:r>
+        <w:t>Image super-resolution, Object detection</w:t>
+      </w:r>
+    </w:p>
+    <w:p>
+      <w:pPr>
+        <w:pStyle w:val="RISBody"/>
+        <w:spacing w:after="30"/>
+      </w:pPr>
+      <w:r>
+        <w:rPr>
+          <w:b/>
+        </w:rPr>
+        <w:t xml:space="preserve">GPU computing: </w:t>
+      </w:r>
+      <w:r>
+        <w:t>CUDA / GPU computing</w:t>
+      </w:r>
+    </w:p>
+    <w:p>
+      <w:pPr>
+        <w:pStyle w:val="RISBody"/>
+        <w:spacing w:after="30"/>
+      </w:pPr>
+      <w:r>
+        <w:rPr>
+          <w:b/>
+        </w:rPr>
+        <w:t xml:space="preserve">Model optimisation: </w:t>
+      </w:r>
+      <w:r>
+        <w:t>TensorRT and ONNX, Pruning and knowledge distillation</w:t>
+      </w:r>
+    </w:p>
+    <w:p>
+      <w:pPr>
+        <w:pStyle w:val="RISBody"/>
+        <w:spacing w:after="30"/>
+      </w:pPr>
+      <w:r>
+        <w:rPr>
+          <w:b/>
+        </w:rPr>
+        <w:t xml:space="preserve">Software &amp; tools: </w:t>
+      </w:r>
+      <w:r>
+        <w:t>Python, Docker and Linux</w:t>
+      </w:r>
+    </w:p>
+    <w:p>
+      <w:pPr>
+        <w:pStyle w:val="RISBody"/>
+        <w:spacing w:after="30"/>
+      </w:pPr>
+      <w:r>
+        <w:rPr>
+          <w:b/>
+        </w:rPr>
+        <w:t xml:space="preserve">Technical leadership: </w:t>
+      </w:r>
+      <w:r>
+        <w:t>Team leadership</w:t>
       </w:r>
     </w:p>
     <w:p>
@@ -2471,81 +2546,6 @@
       </w:r>
       <w:r>
         <w:t>Technical procurement (GeM, GFR)</w:t>
-      </w:r>
-    </w:p>
-    <w:p>
-      <w:pPr>
-        <w:pStyle w:val="RISBody"/>
-        <w:spacing w:after="30"/>
-      </w:pPr>
-      <w:r>
-        <w:rPr>
-          <w:b/>
-        </w:rPr>
-        <w:t xml:space="preserve">IoT: </w:t>
-      </w:r>
-      <w:r>
-        <w:t>MQTT and Node-RED, InfluxDB and Grafana</w:t>
-      </w:r>
-    </w:p>
-    <w:p>
-      <w:pPr>
-        <w:pStyle w:val="RISBody"/>
-        <w:spacing w:after="30"/>
-      </w:pPr>
-      <w:r>
-        <w:rPr>
-          <w:b/>
-        </w:rPr>
-        <w:t xml:space="preserve">Model optimisation: </w:t>
-      </w:r>
-      <w:r>
-        <w:t>TensorRT and ONNX, Pruning and knowledge distillation</w:t>
-      </w:r>
-    </w:p>
-    <w:p>
-      <w:pPr>
-        <w:pStyle w:val="RISBody"/>
-        <w:spacing w:after="30"/>
-      </w:pPr>
-      <w:r>
-        <w:rPr>
-          <w:b/>
-        </w:rPr>
-        <w:t xml:space="preserve">Software &amp; tools: </w:t>
-      </w:r>
-      <w:r>
-        <w:t>Python, Docker and Linux</w:t>
-      </w:r>
-    </w:p>
-    <w:p>
-      <w:pPr>
-        <w:pStyle w:val="RISBody"/>
-        <w:spacing w:after="30"/>
-      </w:pPr>
-      <w:r>
-        <w:rPr>
-          <w:b/>
-        </w:rPr>
-        <w:t xml:space="preserve">Technical leadership: </w:t>
-      </w:r>
-      <w:r>
-        <w:t>Team leadership</w:t>
-      </w:r>
-    </w:p>
-    <w:p>
-      <w:pPr>
-        <w:pStyle w:val="RISBody"/>
-        <w:spacing w:after="30"/>
-      </w:pPr>
-      <w:r>
-        <w:rPr>
-          <w:b/>
-        </w:rPr>
-        <w:t xml:space="preserve">GPU computing: </w:t>
-      </w:r>
-      <w:r>
-        <w:t>CUDA / GPU computing</w:t>
       </w:r>
     </w:p>
     <w:p>

</xml_diff>